<commit_message>
Fill corresponding author contact details in v2.32 manuscript.
Add postal address, phone, and email for the first author on the JAMT submission form.

Co-authored-by: Cursor <cursoragent@cursor.com>
</commit_message>
<xml_diff>
--- a/docs/pilot-study/manuscripts/manuscript_IgakuKensa_AudioScopeEDU_technical_validity_JAMT_v2.32.docx
+++ b/docs/pilot-study/manuscripts/manuscript_IgakuKensa_AudioScopeEDU_technical_validity_JAMT_v2.32.docx
@@ -1026,15 +1026,8 @@
     <w:p/>
     <w:p>
       <w:r>
-        <w:t>1</w:t>
-      </w:r>
-      <w:r>
-        <w:t>）筆頭著者所属（住所）：北海道医療大学リハビリテーション科学部言語聴覚療法学科</w:t>
-      </w:r>
-      <w:bookmarkStart w:id="1" w:name="_Hlk478053893"/>
-      <w:bookmarkStart w:id="2" w:name="_Hlk478053635"/>
-      <w:bookmarkEnd w:id="1"/>
-      <w:bookmarkEnd w:id="2"/>
+        <w:t>1）筆頭著者所属（住所）：北海道医療大学リハビリテーション科学部言語聴覚療法学科（〒061-0293　北海道石狩郡当別町金沢1757）</w:t>
+      </w:r>
     </w:p>
     <w:p>
       <w:r>
@@ -1226,20 +1219,17 @@
     </w:p>
     <w:p>
       <w:r>
-        <w:t>連絡先住所：〒【提出時に記入】</w:t>
-      </w:r>
-    </w:p>
-    <w:p>
-      <w:r>
-        <w:t>電話番号：【提出時に記入】</w:t>
-      </w:r>
-    </w:p>
-    <w:p>
-      <w:r>
-        <w:t>E-mail</w:t>
-      </w:r>
-      <w:r>
-        <w:t>：【提出時に記入】</w:t>
+        <w:t>連絡先住所：〒061-0293　北海道石狩郡当別町金沢1757</w:t>
+      </w:r>
+    </w:p>
+    <w:p>
+      <w:r>
+        <w:t>電話番号：0133-23-1211</w:t>
+      </w:r>
+    </w:p>
+    <w:p>
+      <w:r>
+        <w:t>E-mail：maehide@hoku-iryo-u.ac.jp</w:t>
       </w:r>
     </w:p>
     <w:p>

</xml_diff>